<commit_message>
feat(yard): Aphrodite Terra, the continental farm sown from the clans' piles
The real continent of Venus as 4,096 parcels in six regions named for its
real features, one region per clan, every parcel a template woven from
one of the clans' piles. The page reads the piles the war of clans saved,
sowing draws from them and writes them back, and a grown parcel
propagates into bare neighbours on the clan's period, one unit of the
pile per parcel, so the continent greens outward and stops where the
piles run dry. Seven deep. 27,954 templates on disk.

Co-Authored-By: Claude Fable 5.1 <noreply@anthropic.com>
</commit_message>
<xml_diff>
--- a/PLAN-venus.docx
+++ b/PLAN-venus.docx
@@ -239,6 +239,38 @@
           </w:tcPr>
           <w:p>
             <w:r>
+              <w:t xml:space="preserve">Aphrodite Terra: 4,096 parcels and 6 regions, sown from the piles</w:t>
+            </w:r>
+          </w:p>
+        </w:tc>
+        <w:tc>
+          <w:tcPr>
+            <w:tcW w:w="0" w:type="auto"/>
+          </w:tcPr>
+          <w:p>
+            <w:r>
+              <w:t xml:space="preserve">4,102</w:t>
+            </w:r>
+          </w:p>
+        </w:tc>
+        <w:tc>
+          <w:tcPr>
+            <w:tcW w:w="0" w:type="auto"/>
+          </w:tcPr>
+          <w:p>
+            <w:r>
+              <w:t xml:space="preserve">yes</w:t>
+            </w:r>
+          </w:p>
+        </w:tc>
+      </w:tr>
+      <w:tr>
+        <w:tc>
+          <w:tcPr>
+            <w:tcW w:w="0" w:type="auto"/>
+          </w:tcPr>
+          <w:p>
+            <w:r>
               <w:rPr>
                 <w:b/>
               </w:rPr>
@@ -255,7 +287,7 @@
               <w:rPr>
                 <w:b/>
               </w:rPr>
-              <w:t xml:space="preserve">23,852</w:t>
+              <w:t xml:space="preserve">27,954</w:t>
             </w:r>
           </w:p>
         </w:tc>
@@ -563,7 +595,16 @@
         </w:numPr>
       </w:pPr>
       <w:r>
-        <w:t xml:space="preserve">The continental farm: the clans' piles feed the farm's fields, the farm the village, the village the town; one docket, one chain, seven deep.</w:t>
+        <w:t xml:space="preserve">Done: Aphrodite Terra (</w:t>
+      </w:r>
+      <w:r>
+        <w:rPr>
+          <w:rFonts w:ascii="Consolas" w:hAnsi="Consolas"/>
+        </w:rPr>
+        <w:t xml:space="preserve">continent.mjs</w:t>
+      </w:r>
+      <w:r>
+        <w:t xml:space="preserve">), the continental farm sown from the clans' piles, propagating on the periods, seven deep. Next: its provision as the village's grain and the town's rent, so the chain runs clan → pile → parcel → village → town on one docket.</w:t>
       </w:r>
     </w:p>
     <w:sectPr>

</xml_diff>

<commit_message>
feat(yard): the rules pulled out of the scripts into rulebooks
templates-rules/: one rulebook per deck (clans, market, continent,
village, town), 54 rules with a note each, embedded at build and read by
the page; a rulebook kept in the browser through the editor overrides it
on the deck's next load, so prices, rates, periods and the charter change
without a rebuild. The docket's rulebook is separate and not editable:
what holds from door 1 to door 200 (the cap, the tranches, straight-line
issuance, replay-only balances, two of three to write, the hash chain,
redeem as the only exit, syndication every six months, fungibility: a
unit at door 1 is the unit at door 200), enforced by the ledger, not a page.

Co-Authored-By: Claude Fable 5.1 <noreply@anthropic.com>
</commit_message>
<xml_diff>
--- a/PLAN-venus.docx
+++ b/PLAN-venus.docx
@@ -605,6 +605,28 @@
       </w:r>
       <w:r>
         <w:t xml:space="preserve">), the continental farm sown from the clans' piles, propagating on the periods, seven deep. Its provision goes up to the village as grain, and every ten grain in the village's store feeds a citizen of the town, so the chain runs clan → pile → parcel → village → town on one docket. The town's rent is paid back down to the clans, split by whose region grew the provision, and becomes stock in their piles at the docket price; the loop is closed. Next: the market's four farms priced from the loop's real throughput instead of a hash.</w:t>
+      </w:r>
+    </w:p>
+    <w:p>
+      <w:pPr>
+        <w:pStyle w:val="Heading2"/>
+      </w:pPr>
+      <w:r>
+        <w:t xml:space="preserve">The rules, pulled out</w:t>
+      </w:r>
+    </w:p>
+    <w:p>
+      <w:r>
+        <w:t xml:space="preserve">Every number the loop plays by is in </w:t>
+      </w:r>
+      <w:r>
+        <w:rPr>
+          <w:rFonts w:ascii="Consolas" w:hAnsi="Consolas"/>
+        </w:rPr>
+        <w:t xml:space="preserve">templates-rules/</w:t>
+      </w:r>
+      <w:r>
+        <w:t xml:space="preserve">: one rulebook per deck (clans, market, continent, village, town), 54 rules with a note each, embedded at build and read by the page. A rulebook kept in the browser through the editor overrides it on the deck's next load, so prices, rates, periods and the charter change without a rebuild. The docket's rulebook is separate and not editable: it is what holds from door 1 to door 200, and the ledger enforces it rather than any page.</w:t>
       </w:r>
     </w:p>
     <w:p>

</xml_diff>

<commit_message>
feat(yard): the look pulled out of the module into templates-theme
The ship's look is a JSON file now: palette, type, sky, glows, the
fireflies' colours and layers and timings, the glass, the standard.
_active.json names the theme that is on, and toonami.mjs only turns it
into CSS. Two themes: Hesperus and Wine-dark. One word in _active.json
and a re-stamp repaints all 119 pages with no code edited; the look stays
stamped CSS so the script-free pages stay script-free, which is the one
place a browser-kept copy cannot act on its own, and the editor says so.

The docket's rulebook also gains the reading of the cap: 21,000,000 units
is 21,000,000 chances to act, not a scarcity; prices are decentralized
door by door, and the effort is centralized at the syndicates, where every
door's events are reconciled into one chain.

Co-Authored-By: Claude Opus 5 <noreply@anthropic.com>
</commit_message>
<xml_diff>
--- a/PLAN-venus.docx
+++ b/PLAN-venus.docx
@@ -627,6 +627,61 @@
       </w:r>
       <w:r>
         <w:t xml:space="preserve">: one rulebook per deck (clans, market, continent, village, town), 54 rules with a note each, embedded at build and read by the page. A rulebook kept in the browser through the editor overrides it on the deck's next load, so prices, rates, periods and the charter change without a rebuild. The docket's rulebook is separate and not editable: it is what holds from door 1 to door 200, and the ledger enforces it rather than any page.</w:t>
+      </w:r>
+    </w:p>
+    <w:p>
+      <w:pPr>
+        <w:pStyle w:val="Heading2"/>
+      </w:pPr>
+      <w:r>
+        <w:t xml:space="preserve">The look, pulled out</w:t>
+      </w:r>
+    </w:p>
+    <w:p>
+      <w:r>
+        <w:rPr>
+          <w:rFonts w:ascii="Consolas" w:hAnsi="Consolas"/>
+        </w:rPr>
+        <w:t xml:space="preserve">templates-theme/</w:t>
+      </w:r>
+      <w:r>
+        <w:t xml:space="preserve"> holds the ship's look: palette, type, sky, glows, the fireflies' colours and layers, the glass, the standard. </w:t>
+      </w:r>
+      <w:r>
+        <w:rPr>
+          <w:rFonts w:ascii="Consolas" w:hAnsi="Consolas"/>
+        </w:rPr>
+        <w:t xml:space="preserve">_active.json</w:t>
+      </w:r>
+      <w:r>
+        <w:t xml:space="preserve"> names which theme is on, and </w:t>
+      </w:r>
+      <w:r>
+        <w:rPr>
+          <w:rFonts w:ascii="Consolas" w:hAnsi="Consolas"/>
+        </w:rPr>
+        <w:t xml:space="preserve">toonami.mjs</w:t>
+      </w:r>
+      <w:r>
+        <w:t xml:space="preserve"> only turns it into CSS. Two themes ship: Hesperus and Wine-dark. Change one word in </w:t>
+      </w:r>
+      <w:r>
+        <w:rPr>
+          <w:rFonts w:ascii="Consolas" w:hAnsi="Consolas"/>
+        </w:rPr>
+        <w:t xml:space="preserve">_active.json</w:t>
+      </w:r>
+      <w:r>
+        <w:t xml:space="preserve">, run </w:t>
+      </w:r>
+      <w:r>
+        <w:rPr>
+          <w:rFonts w:ascii="Consolas" w:hAnsi="Consolas"/>
+        </w:rPr>
+        <w:t xml:space="preserve">node toonami-all.mjs</w:t>
+      </w:r>
+      <w:r>
+        <w:t xml:space="preserve">, and all 119 pages are repainted with no code edited. The look is the one thing a browser-kept copy cannot change on its own, because it is stamped CSS, which is what keeps the script-free pages free of script.</w:t>
       </w:r>
     </w:p>
     <w:p>

</xml_diff>